<commit_message>
feat(esquema): D-59, editar presupuestos exige Ver APU
fn_rol_permisos_coherentes rechaza al confirmar un rol que edita presupuestos
sin Ver APU, y quitarle Ver APU despues (DELETE o UPDATE). Documento 02 §6.5:
los APU inactivos no se ofrecen en el buscador de Agregar Actividad.
</commit_message>
<xml_diff>
--- a/docs/02 - Guia de comportamiento de interfaz.docx
+++ b/docs/02 - Guia de comportamiento de interfaz.docx
@@ -5346,6 +5346,24 @@
           <w:szCs w:val="20"/>
         </w:rPr>
         <w:t>Un APU no se puede eliminar si alguna de sus versiones está usada en alguna actividad de algún presupuesto, en cualquier estado. Si no lo está, se elimina con sus versiones y sus líneas. Si lo está, el mensaje dice en cuántas actividades y ofrece la salida real, que es marcarlo como inactivo para que deje de ofrecerse al armar APU nuevos.</w:t>
+      </w:r>
+    </w:p>
+    <w:p>
+      <w:pPr>
+        <w:pStyle w:val="ListParagraph"/>
+        <w:numPr>
+          <w:ilvl w:val="0"/>
+          <w:numId w:val="2"/>
+        </w:numPr>
+        <w:spacing w:after="90" w:line="276"/>
+        <w:jc w:val="both"/>
+      </w:pPr>
+      <w:r>
+        <w:rPr>
+          <w:sz w:val="20"/>
+          <w:szCs w:val="20"/>
+        </w:rPr>
+        <w:t>Un APU inactivo tampoco se ofrece en el buscador de «+ Agregar Actividad» de la mesa de trabajo (§8.3). No desaparece: la vista maestra del módulo APU lo sigue mostrando para poder reactivarlo, y las actividades que ya lo usan se conservan tal cual, porque desactivar un APU después de haberlo usado es legítimo y la base no lo impide.</w:t>
       </w:r>
     </w:p>
     <w:p>

</xml_diff>

<commit_message>
feat(esquema): D-71 (logo y comprobantes, nombres unicos de recurso y APU), panel de superadministracion en web y logo en Configuracion
El esquema, docs/prueba-d71.sql, web/, el documento 02, el contrato y
bitacora-web.md los escribio el otro asistente, no quien hace este commit.
Verificado aqui contra construsoft_test: las cuatro pruebas de psql (D-71 en
19 de 19), los tres verificadores en cero, y vite build limpio.

De este lado: subirLogo y quitarLogo, leerLogo como octava excepcion
documentada, las pruebas que guardaban una ruta de logo inventada ahora suben
un PNG real, y ux_recurso_nombre y ux_apu_nombre llegan con su mensaje y su
campo.
</commit_message>
<xml_diff>
--- a/docs/02 - Guia de comportamiento de interfaz.docx
+++ b/docs/02 - Guia de comportamiento de interfaz.docx
@@ -2003,6 +2003,58 @@
           <w:szCs w:val="20"/>
         </w:rPr>
         <w:t xml:space="preserve">Por una URL propia y separada de la de los inquilinos. No comparte pantalla de login con los usuarios de las empresas.</w:t>
+      </w:r>
+    </w:p>
+    <w:p>
+      <w:pPr>
+        <w:spacing w:after="120" w:before="0" w:line="276"/>
+        <w:jc w:val="both"/>
+      </w:pPr>
+      <w:r>
+        <w:rPr>
+          <w:sz w:val="20"/>
+          <w:szCs w:val="20"/>
+        </w:rPr>
+        <w:t>El panel vive en /superadmin/ y tiene su propio ingreso, su propia sesión y su propio menú: Resumen, Empresas, Pagos y Bitácora. Usa el mismo marco que la aplicación de las empresas —barra lateral plegable, migas, tarjetas y capas—, y bajo la marca lleva un sello «Plataforma» para que nadie confunda en qué consola está. El superadministrador se crea por terminal y elige su contraseña allí mismo (decisión del dueño, 9 de octubre de 2026).</w:t>
+      </w:r>
+    </w:p>
+    <w:p>
+      <w:pPr>
+        <w:spacing w:after="120" w:before="0" w:line="276"/>
+        <w:jc w:val="both"/>
+      </w:pPr>
+      <w:r>
+        <w:rPr>
+          <w:sz w:val="20"/>
+          <w:szCs w:val="20"/>
+        </w:rPr>
+        <w:t>El resumen muestra cuántas empresas pagan, cuántas están en prueba, vencidas o suspendidas, lo que entró en el mes, y dos listas que piden una acción: las que vencen en los próximos siete días y las pruebas vencidas sin pago. La lista de empresas se filtra por estado y por plan, y se busca por razón social o NIT.</w:t>
+      </w:r>
+    </w:p>
+    <w:p>
+      <w:pPr>
+        <w:spacing w:after="120" w:before="0" w:line="276"/>
+        <w:jc w:val="both"/>
+      </w:pPr>
+      <w:r>
+        <w:rPr>
+          <w:sz w:val="20"/>
+          <w:szCs w:val="20"/>
+        </w:rPr>
+        <w:t>La ficha de cada empresa pone arriba lo de todos los días —registrar un pago, cambiar plan o vencimiento, suspender o reactivar, designar administrador— y abajo, separada, una zona de cuidado con lo que no tiene vuelta atrás: cancelar la suscripción y eliminar los datos. Toda acción pide un motivo y queda en la bitácora del panel. El panel no ve proyectos ni catálogos de las empresas: solo cuántos tienen.</w:t>
+      </w:r>
+    </w:p>
+    <w:p>
+      <w:pPr>
+        <w:spacing w:after="120" w:before="0" w:line="276"/>
+        <w:jc w:val="both"/>
+      </w:pPr>
+      <w:r>
+        <w:rPr>
+          <w:sz w:val="20"/>
+          <w:szCs w:val="20"/>
+        </w:rPr>
+        <w:t>Registrar un pago pide el monto, la fecha, el método, la referencia y, opcionalmente, el comprobante (PNG, JPEG o PDF hasta 5 MB). Cubre un período de 1, 3, 6 o 12 meses, o hasta una fecha que se escribe a mano. Antes de guardar, la capa muestra hasta cuándo queda vigente, contando desde el vencimiento actual o desde hoy, lo que sea más tarde. Eliminar los datos exige escribir la razón social exacta y solo se ofrece para pruebas vencidas hace más de 10 días sin pago.</w:t>
       </w:r>
     </w:p>
     <w:p>
@@ -10739,6 +10791,19 @@
           <w:szCs w:val="20"/>
         </w:rPr>
         <w:t>Formulario con razón social, NIT, dirección y teléfono, los cuatro editables, más la carga del logotipo en PNG o JPG. Si el NIT ya existe en otra empresa, el mensaje lo dice y pide revisarlo. El logo y el NIT se imprimen automáticamente en el encabezado de todos los PDF y exportaciones.</w:t>
+      </w:r>
+    </w:p>
+    <w:p>
+      <w:pPr>
+        <w:spacing w:after="120" w:before="0" w:line="276"/>
+        <w:jc w:val="both"/>
+      </w:pPr>
+      <w:r>
+        <w:rPr>
+          <w:sz w:val="20"/>
+          <w:szCs w:val="20"/>
+        </w:rPr>
+        <w:t>El logotipo va en su propia sección, debajo del formulario: elegir el archivo lo sube, sin un «Guardar» aparte. Solo PNG o JPEG, hasta 1 MB. Se ve sobre fondo blanco, también en el tema oscuro, porque así sale impreso. Quitarlo no borra la imagen: las versiones guardadas de los proyectos conservan el logotipo que tenían, y una oferta reimpresa se ve igual que el día en que salió (D-64, D-71).</w:t>
       </w:r>
     </w:p>
     <w:p>

</xml_diff>

<commit_message>
feat: pago reportado por la empresa y su verificacion en el panel (CONTRATO §14)
</commit_message>
<xml_diff>
--- a/docs/02 - Guia de comportamiento de interfaz.docx
+++ b/docs/02 - Guia de comportamiento de interfaz.docx
@@ -2028,7 +2028,7 @@
           <w:sz w:val="20"/>
           <w:szCs w:val="20"/>
         </w:rPr>
-        <w:t>El resumen muestra cuántas empresas pagan, cuántas están en prueba, vencidas o suspendidas, lo que entró en el mes, y dos listas que piden una acción: las que vencen en los próximos siete días y las pruebas vencidas sin pago. La lista de empresas se filtra por estado y por plan, y se busca por razón social o NIT.</w:t>
+        <w:t>El resumen muestra cuántas empresas pagan, cuántas están en prueba, vencidas o suspendidas, lo que entró en el mes, y las listas que piden una acción. La primera, arriba de todo, son los pagos por verificar: los que reportaron las empresas y nadie ha revisado, del más antiguo al más reciente. Debajo, las que vencen en los próximos siete días y las pruebas vencidas sin pago. La lista de empresas se filtra por estado y por plan, y se busca por razón social o NIT.</w:t>
       </w:r>
     </w:p>
     <w:p>
@@ -2055,6 +2055,19 @@
           <w:szCs w:val="20"/>
         </w:rPr>
         <w:t>Registrar un pago pide el monto, la fecha, el método, la referencia y, opcionalmente, el comprobante (PNG, JPEG o PDF hasta 5 MB). Cubre un período de 1, 3, 6 o 12 meses, o hasta una fecha que se escribe a mano. Antes de guardar, la capa muestra hasta cuándo queda vigente, contando desde el vencimiento actual o desde hoy, lo que sea más tarde. Eliminar los datos exige escribir la razón social exacta y solo se ofrece para pruebas vencidas hace más de 10 días sin pago.</w:t>
+      </w:r>
+    </w:p>
+    <w:p>
+      <w:pPr>
+        <w:spacing w:after="120" w:before="0" w:line="276"/>
+        <w:jc w:val="both"/>
+      </w:pPr>
+      <w:r>
+        <w:rPr>
+          <w:sz w:val="20"/>
+          <w:szCs w:val="20"/>
+        </w:rPr>
+        <w:t>Un pago que reportó la empresa aparece en su ficha como «Pago por verificar», con el comprobante a un clic. Confirmarlo pide revisar el período (viene el que pidió la empresa), muestra hasta cuándo queda vigente y exige marcar «Revisé el comprobante y el dinero está en la cuenta»: solo entonces se activa el plan. Rechazarlo pide un motivo, que la empresa lee tal cual. La lista de pagos se filtra también por estado —confirmado, por verificar, rechazado— y su total suma solo los confirmados (D-73).</w:t>
       </w:r>
     </w:p>
     <w:p>
@@ -10845,7 +10858,33 @@
           <w:sz w:val="20"/>
           <w:szCs w:val="20"/>
         </w:rPr>
-        <w:t xml:space="preserve">Debajo, la tabla del historial de facturación con fecha, concepto, monto, método de pago y estado, y un botón por fila para descargar el comprobante en PDF.</w:t>
+        <w:t>La empresa paga por fuera —transferencia, PSE o efectivo— y lo reporta con «Reportar un pago»: monto, fecha, medio, referencia, cuántos meses paga (1, 3, 6 o 12) y el comprobante, que es obligatorio. El botón lo ve el Administrador o quien tenga el permiso de suscripción, también con la suscripción vencida, que es cuando más falta hace; no aparece con la suscripción cancelada ni mientras haya un pago esperando.</w:t>
+      </w:r>
+    </w:p>
+    <w:p>
+      <w:pPr>
+        <w:spacing w:after="120" w:before="0" w:line="276"/>
+        <w:jc w:val="both"/>
+      </w:pPr>
+      <w:r>
+        <w:rPr>
+          <w:sz w:val="20"/>
+          <w:szCs w:val="20"/>
+        </w:rPr>
+        <w:t>Reportar no da acceso. El pago queda «En verificación» con una franja que lo dice, y la empresa sigue en el estado que tenía hasta que el superadministrador lo confirma, porque un comprobante puede ser falso. Si lo rechaza, la pantalla muestra una alerta con el motivo y la empresa puede reportar de nuevo (D-73).</w:t>
+      </w:r>
+    </w:p>
+    <w:p>
+      <w:pPr>
+        <w:spacing w:after="120" w:before="0" w:line="276"/>
+        <w:jc w:val="both"/>
+      </w:pPr>
+      <w:r>
+        <w:rPr>
+          <w:sz w:val="20"/>
+          <w:szCs w:val="20"/>
+        </w:rPr>
+        <w:t>Debajo, la tabla del historial de facturación con fecha, concepto, monto, método de pago y estado —Confirmado, En verificación o Rechazado—, del más reciente al más antiguo, y un botón por fila para descargar el comprobante en PDF.</w:t>
       </w:r>
     </w:p>
     <w:p>

</xml_diff>

<commit_message>
feat: numeracion de la EDT (D-75, CONTRATO §16): subcapitulos primero, ceros a la izquierda, capitulo sin .0, y el codigo del APU en las actividades de la mesa, el PDF y el Excel
</commit_message>
<xml_diff>
--- a/docs/02 - Guia de comportamiento de interfaz.docx
+++ b/docs/02 - Guia de comportamiento de interfaz.docx
@@ -7076,7 +7076,7 @@
           <w:sz w:val="20"/>
           <w:szCs w:val="20"/>
         </w:rPr>
-        <w:t>El sistema asigna y recalcula la codificación automáticamente, y el usuario nunca la escribe. El capítulo se numera 1.0 y sus hijos 1.1, 1.2, 1.3; los hijos de un subcapítulo, 1.1.1 y siguientes. Capítulos y actividades comparten el contador de su padre, así que una actividad colgada del capítulo queda entre sus subcapítulos sin chocar: 1.0 CIMENTACIÓN, 1.1 Excavación manual, 1.2 Concretos, 1.2.1 Concreto de zapatas.</w:t>
+        <w:t>El sistema asigna y recalcula la codificación automáticamente, y el usuario nunca la escribe. Bajo cada capítulo o subcapítulo van primero sus subcapítulos y después sus actividades directas, a cualquier profundidad. Los capítulos se numeran 1, 2, 3 y los subcapítulos 1.1, 1.2 y 1.1.1, con ceros a la izquierda para que todos los del mismo nivel tengan el mismo ancho: de 10 a 99 en un nivel, dos cifras (01 … 12); de 100 a 999, tres. Las actividades no llevan número jerárquico: en la columna del código muestran el código de su APU, y el bloque en que están dice a qué capítulo pertenecen. Por ejemplo: 01 CIMENTACIÓN, 01.1 Concretos, APU-0007 Concreto de zapatas, APU-0005 Excavación manual (decisión del dueño, 13 de octubre de 2026; D-75).</w:t>
       </w:r>
     </w:p>
     <w:p>
@@ -7128,7 +7128,7 @@
           <w:sz w:val="20"/>
           <w:szCs w:val="20"/>
         </w:rPr>
-        <w:t xml:space="preserve">Reordenar la posición, desplazando arriba o abajo. La numeración de todos los hermanos se recalcula sola.</w:t>
+        <w:t>Reordenar la posición, desplazando arriba o abajo. Un subcapítulo se mueve entre los subcapítulos de su nivel y una actividad entre las actividades: los subcapítulos siempre quedan arriba. La numeración de todos los hermanos se recalcula sola.</w:t>
       </w:r>
     </w:p>
     <w:p>
@@ -7206,7 +7206,7 @@
           <w:sz w:val="20"/>
           <w:szCs w:val="20"/>
         </w:rPr>
-        <w:t>En una estructura por EDT, cada capítulo y cada subcapítulo tiene su propia casilla, y la casilla dice a qué nivel pertenece: «Agregar actividad en 1.2 Vigas de amarre». La fila de cada capítulo y subcapítulo lleva además un botón para agregar una actividad ahí mismo, con un icono distinto del de agregar subcapítulo. Así, el ítem 1.1.1 se agrega dentro del subcapítulo 1.1, sin confundirlo con el capítulo de arriba.</w:t>
+        <w:t>En una estructura por EDT, cada capítulo y cada subcapítulo tiene su propia casilla, y la casilla dice a qué nivel pertenece: «Agregar actividad en 01.2 Vigas de amarre». La fila de cada capítulo y subcapítulo lleva además un botón para agregar una actividad ahí mismo, con un icono distinto del de agregar subcapítulo. Así, una actividad se agrega dentro del subcapítulo 01.1, sin confundirlo con el capítulo de arriba.</w:t>
       </w:r>
     </w:p>
     <w:p>

</xml_diff>

<commit_message>
docs: CONTRATO §6 y §19 con las respuestas a la API (permisos de lectura, RF-APU-25, ALAP, gzip, D-94); 02, 07 y 00 al día; bitácora con la 0007 en el árbol
Co-Authored-By: Claude Opus 5.5 <noreply@anthropic.com>
Claude-Session: https://claude.ai/code/session_01QkUecTxXWHcSEBT7CByXQu
</commit_message>
<xml_diff>
--- a/docs/02 - Guia de comportamiento de interfaz.docx
+++ b/docs/02 - Guia de comportamiento de interfaz.docx
@@ -3703,7 +3703,7 @@
           <w:sz w:val="20"/>
           <w:szCs w:val="20"/>
         </w:rPr>
-        <w:t xml:space="preserve">Con el módulo de programación (documento 07, RF-APU-25) la versión del APU gana un campo opcional más: el rendimiento de la actividad, en unidades por jornal, del que sale la duración en el cronograma.</w:t>
+        <w:t xml:space="preserve">Con el módulo de programación (documento 07, RF-APU-25) la versión del APU gana un campo opcional más: el rendimiento de la actividad, en unidades por jornal, del que sale la duración en el cronograma. Va junto al nombre y la unidad, rotulado «Rendimiento de la actividad (unidades por jornal)» para que no se confunda con el rendimiento de cada recurso; es opcional, mayor que cero y con hasta cuatro decimales. Cambiarlo es editar el APU: crea una versión nueva y hace la misma pregunta por los presupuestos abiertos (§6.4).</w:t>
       </w:r>
     </w:p>
     <w:p>
@@ -5690,7 +5690,7 @@
           <w:sz w:val="20"/>
           <w:szCs w:val="20"/>
         </w:rPr>
-        <w:t>Igual que en Recursos (§5.5): plantilla, todo o nada, y el informe por fila. La plantilla de APU tiene una hoja con los APU —nombre y unidad, más una clave que la persona inventa para unir las hojas— y otra con la composición, una fila por línea con el código del recurso, la cantidad, el rendimiento y el desperdicio. Una tercera hoja trae el catálogo de recursos vigente, solo para consultar los códigos. Los recursos tienen que existir antes de importar los APU que los usan.</w:t>
+        <w:t>Igual que en Recursos (§5.5): plantilla, todo o nada, y el informe por fila. La plantilla de APU tiene una hoja con los APU —nombre, unidad y, opcional, el rendimiento de la actividad, más una clave que la persona inventa para unir las hojas— y otra con la composición, una fila por línea con el código del recurso, la cantidad, el rendimiento y el desperdicio. Una tercera hoja trae el catálogo de recursos vigente, solo para consultar los códigos. Los recursos tienen que existir antes de importar los APU que los usan.</w:t>
       </w:r>
     </w:p>
     <w:p>

</xml_diff>

<commit_message>
feat(web): las pantallas del modulo 1, programacion de obra (CONTRATO 19)
- Configuracion: horas por jornal e inicio de semana; pestana Calendarios y
  festivos (tabla de medias horas, llenado rapido, excepciones, copiar
  festivos, listas propias con plantilla de Excel).
- APU: el rendimiento de la actividad (RF-APU-25).
- Cronograma: crear, Gantt con la tabla fija y solo las filas visibles,
  panel de actividad con restricciones y relaciones, hitos, tramites y
  subgrupos, calendario de la obra, lineas base, curvas S, revision,
  exportar, las franjas y el 409 que conserva el cambio rechazado.
- CONTRATO 19.5 y 19.6: inicioSemana en la cabecera y ?lineaBase= en las
  escrituras. DISENO y 02 (11.5, 11.8 y capitulo 13) al dia.

Co-Authored-By: Claude Opus 5.5 <noreply@anthropic.com>
Claude-Session: https://claude.ai/code/session_01QkUecTxXWHcSEBT7CByXQu
</commit_message>
<xml_diff>
--- a/docs/02 - Guia de comportamiento de interfaz.docx
+++ b/docs/02 - Guia de comportamiento de interfaz.docx
@@ -11589,6 +11589,55 @@
     </w:p>
     <w:p>
       <w:pPr>
+        <w:pStyle w:val="ListParagraph"/>
+        <w:numPr>
+          <w:ilvl w:val="0"/>
+          <w:numId w:val="2"/>
+        </w:numPr>
+        <w:spacing w:after="90" w:line="276"/>
+        <w:jc w:val="both"/>
+      </w:pPr>
+      <w:r>
+        <w:rPr>
+          <w:sz w:val="20"/>
+          <w:szCs w:val="20"/>
+        </w:rPr>
+        <w:t xml:space="preserve">Horas por jornal, de 1 a 24, 8 por defecto (RF-CFG-27). Es lo que dura el «día» del rendimiento de un APU. Cada proyecto se lleva su copia al crearse: cambiarlas aquí no mueve los proyectos que ya existen.</w:t>
+      </w:r>
+    </w:p>
+    <w:p>
+      <w:pPr>
+        <w:pStyle w:val="ListParagraph"/>
+        <w:numPr>
+          <w:ilvl w:val="0"/>
+          <w:numId w:val="2"/>
+        </w:numPr>
+        <w:spacing w:after="90" w:line="276"/>
+        <w:jc w:val="both"/>
+      </w:pPr>
+      <w:r>
+        <w:rPr>
+          <w:sz w:val="20"/>
+          <w:szCs w:val="20"/>
+        </w:rPr>
+        <w:t xml:space="preserve">Día en que empieza la semana, lunes por defecto (RF-CFG-33). Lo usan la curva semanal y el Gantt.</w:t>
+      </w:r>
+    </w:p>
+    <w:p>
+      <w:pPr>
+        <w:spacing w:after="120" w:before="0" w:line="276"/>
+        <w:jc w:val="both"/>
+      </w:pPr>
+      <w:r>
+        <w:rPr>
+          <w:sz w:val="20"/>
+          <w:szCs w:val="20"/>
+        </w:rPr>
+        <w:t xml:space="preserve">Las dos últimas van en su propia tarjeta, «Programación de obra», y se guardan con el mismo «Guardar preferencias» que las demás (documento 07 §6).</w:t>
+      </w:r>
+    </w:p>
+    <w:p>
+      <w:pPr>
         <w:pStyle w:val="Heading2"/>
         <w:spacing w:after="120" w:before="300"/>
       </w:pPr>
@@ -12855,6 +12904,253 @@
     </w:p>
     <w:p>
       <w:pPr>
+        <w:pStyle w:val="Heading2"/>
+        <w:spacing w:after="120" w:before="300"/>
+      </w:pPr>
+      <w:r>
+        <w:rPr>
+          <w:b/>
+          <w:bCs/>
+          <w:color w:val="1F2933"/>
+          <w:sz w:val="23"/>
+          <w:szCs w:val="23"/>
+        </w:rPr>
+        <w:t>11.8 Calendarios y festivos</w:t>
+      </w:r>
+    </w:p>
+    <w:p>
+      <w:pPr>
+        <w:spacing w:after="120" w:before="0" w:line="276"/>
+        <w:jc w:val="both"/>
+      </w:pPr>
+      <w:r>
+        <w:rPr>
+          <w:sz w:val="20"/>
+          <w:szCs w:val="20"/>
+        </w:rPr>
+        <w:t xml:space="preserve">Una pestaña propia, con el permiso de preferencias (RF-CFG-29, RF-CFG-32; documento 07 §6.2). A la izquierda, los calendarios de la empresa; a la derecha, las listas de festivos. Cada proyecto se lleva una copia del calendario al crear su cronograma, así que editar uno de aquí no mueve ninguna obra (D-86).</w:t>
+      </w:r>
+    </w:p>
+    <w:p>
+      <w:pPr>
+        <w:pStyle w:val="ListParagraph"/>
+        <w:numPr>
+          <w:ilvl w:val="0"/>
+          <w:numId w:val="2"/>
+        </w:numPr>
+        <w:spacing w:after="90" w:line="276"/>
+        <w:jc w:val="both"/>
+      </w:pPr>
+      <w:r>
+        <w:rPr>
+          <w:b/>
+          <w:bCs/>
+          <w:sz w:val="20"/>
+          <w:szCs w:val="20"/>
+        </w:rPr>
+        <w:t xml:space="preserve">Abrir un calendario</w:t>
+      </w:r>
+      <w:r>
+        <w:rPr>
+          <w:sz w:val="20"/>
+          <w:szCs w:val="20"/>
+        </w:rPr>
+        <w:t xml:space="preserve"> muestra su semana, de dónde salieron sus festivos y sus excepciones. «Editar semana» abre el formulario encima; «Usar por defecto» lo marca como el que se propone al crear un cronograma, y «Eliminar» lo quita. El de por defecto no se elimina ni se desmarca: se marca otro.</w:t>
+      </w:r>
+    </w:p>
+    <w:p>
+      <w:pPr>
+        <w:pStyle w:val="ListParagraph"/>
+        <w:numPr>
+          <w:ilvl w:val="0"/>
+          <w:numId w:val="2"/>
+        </w:numPr>
+        <w:spacing w:after="90" w:line="276"/>
+        <w:jc w:val="both"/>
+      </w:pPr>
+      <w:r>
+        <w:rPr>
+          <w:b/>
+          <w:bCs/>
+          <w:sz w:val="20"/>
+          <w:szCs w:val="20"/>
+        </w:rPr>
+        <w:t xml:space="preserve">La semana se pinta en una tabla de días por horas</w:t>
+      </w:r>
+      <w:r>
+        <w:rPr>
+          <w:sz w:val="20"/>
+          <w:szCs w:val="20"/>
+        </w:rPr>
+        <w:t xml:space="preserve">, en bloques de media hora, como en P6: arrastrando con el mouse, o con las flechas y la barra espaciadora. El total por día y por semana se ve al lado, y debajo cada día en texto. Un turno que pasa la medianoche se marca en los dos días.</w:t>
+      </w:r>
+    </w:p>
+    <w:p>
+      <w:pPr>
+        <w:pStyle w:val="ListParagraph"/>
+        <w:numPr>
+          <w:ilvl w:val="0"/>
+          <w:numId w:val="2"/>
+        </w:numPr>
+        <w:spacing w:after="90" w:line="276"/>
+        <w:jc w:val="both"/>
+      </w:pPr>
+      <w:r>
+        <w:rPr>
+          <w:b/>
+          <w:bCs/>
+          <w:sz w:val="20"/>
+          <w:szCs w:val="20"/>
+        </w:rPr>
+        <w:t xml:space="preserve">El llenado rápido</w:t>
+      </w:r>
+      <w:r>
+        <w:rPr>
+          <w:sz w:val="20"/>
+          <w:szCs w:val="20"/>
+        </w:rPr>
+        <w:t xml:space="preserve"> cubre el caso normal: hora de entrada, horas de trabajo, almuerzo y días, con la opción de un sábado más corto. «Pintar la tabla» la llena, y después se corrige a mano.</w:t>
+      </w:r>
+    </w:p>
+    <w:p>
+      <w:pPr>
+        <w:pStyle w:val="ListParagraph"/>
+        <w:numPr>
+          <w:ilvl w:val="0"/>
+          <w:numId w:val="2"/>
+        </w:numPr>
+        <w:spacing w:after="90" w:line="276"/>
+        <w:jc w:val="both"/>
+      </w:pPr>
+      <w:r>
+        <w:rPr>
+          <w:b/>
+          <w:bCs/>
+          <w:sz w:val="20"/>
+          <w:szCs w:val="20"/>
+        </w:rPr>
+        <w:t xml:space="preserve">«1 día equivale a»</w:t>
+      </w:r>
+      <w:r>
+        <w:rPr>
+          <w:sz w:val="20"/>
+          <w:szCs w:val="20"/>
+        </w:rPr>
+        <w:t xml:space="preserve"> convierte las horas en los días que se ven en pantalla. No cambia el cálculo.</w:t>
+      </w:r>
+    </w:p>
+    <w:p>
+      <w:pPr>
+        <w:pStyle w:val="ListParagraph"/>
+        <w:numPr>
+          <w:ilvl w:val="0"/>
+          <w:numId w:val="2"/>
+        </w:numPr>
+        <w:spacing w:after="90" w:line="276"/>
+        <w:jc w:val="both"/>
+      </w:pPr>
+      <w:r>
+        <w:rPr>
+          <w:b/>
+          <w:bCs/>
+          <w:sz w:val="20"/>
+          <w:szCs w:val="20"/>
+        </w:rPr>
+        <w:t xml:space="preserve">Las excepciones</w:t>
+      </w:r>
+      <w:r>
+        <w:rPr>
+          <w:sz w:val="20"/>
+          <w:szCs w:val="20"/>
+        </w:rPr>
+        <w:t xml:space="preserve"> son fechas que no se trabajan (un festivo, un día perdido por lluvia) o que se trabajan con otras horas (un sábado completo). Se agregan, editan y quitan una por una, y se guardan al momento.</w:t>
+      </w:r>
+    </w:p>
+    <w:p>
+      <w:pPr>
+        <w:pStyle w:val="ListParagraph"/>
+        <w:numPr>
+          <w:ilvl w:val="0"/>
+          <w:numId w:val="2"/>
+        </w:numPr>
+        <w:spacing w:after="90" w:line="276"/>
+        <w:jc w:val="both"/>
+      </w:pPr>
+      <w:r>
+        <w:rPr>
+          <w:b/>
+          <w:bCs/>
+          <w:sz w:val="20"/>
+          <w:szCs w:val="20"/>
+        </w:rPr>
+        <w:t xml:space="preserve">Copiar festivos</w:t>
+      </w:r>
+      <w:r>
+        <w:rPr>
+          <w:sz w:val="20"/>
+          <w:szCs w:val="20"/>
+        </w:rPr>
+        <w:t xml:space="preserve"> trae una lista entera, oficial o de la empresa. Cada fecha entra como día no laborable, y las que el calendario ya tenía no se tocan: un festivo que la empresa trabaja sigue marcado como laborable. Al terminar dice cuántas fechas entraron.</w:t>
+      </w:r>
+    </w:p>
+    <w:p>
+      <w:pPr>
+        <w:pStyle w:val="ListParagraph"/>
+        <w:numPr>
+          <w:ilvl w:val="0"/>
+          <w:numId w:val="2"/>
+        </w:numPr>
+        <w:spacing w:after="90" w:line="276"/>
+        <w:jc w:val="both"/>
+      </w:pPr>
+      <w:r>
+        <w:rPr>
+          <w:b/>
+          <w:bCs/>
+          <w:sz w:val="20"/>
+          <w:szCs w:val="20"/>
+        </w:rPr>
+        <w:t xml:space="preserve">Las listas oficiales</w:t>
+      </w:r>
+      <w:r>
+        <w:rPr>
+          <w:sz w:val="20"/>
+          <w:szCs w:val="20"/>
+        </w:rPr>
+        <w:t xml:space="preserve"> las mantiene ConstruSoft, por ventanas de cinco años, y se ven como de solo lectura. </w:t>
+      </w:r>
+      <w:r>
+        <w:rPr>
+          <w:b/>
+          <w:bCs/>
+          <w:sz w:val="20"/>
+          <w:szCs w:val="20"/>
+        </w:rPr>
+        <w:t xml:space="preserve">Las de la empresa</w:t>
+      </w:r>
+      <w:r>
+        <w:rPr>
+          <w:sz w:val="20"/>
+          <w:szCs w:val="20"/>
+        </w:rPr>
+        <w:t xml:space="preserve"> se crean a mano (fecha y nombre opcional) o se importan con la plantilla de Excel, como los recursos (§5.5): todo o nada, con el informe fila por fila. Solo las ve su empresa (D-90). Eliminar una lista no toca los calendarios que ya la copiaron.</w:t>
+      </w:r>
+    </w:p>
+    <w:p>
+      <w:pPr>
+        <w:spacing w:after="120" w:before="0" w:line="276"/>
+        <w:jc w:val="both"/>
+      </w:pPr>
+      <w:r>
+        <w:rPr>
+          <w:sz w:val="20"/>
+          <w:szCs w:val="20"/>
+        </w:rPr>
+        <w:t xml:space="preserve">Una empresa nace con un calendario de lunes a viernes, de 7:00 a 12:00 y de 13:00 a 16:00, marcado por defecto y sin festivos: la tarjeta del calendario ofrece copiar la lista del país.</w:t>
+      </w:r>
+    </w:p>
+    <w:p>
+      <w:pPr>
         <w:pStyle w:val="Heading1"/>
         <w:pBdr>
           <w:bottom w:val="single" w:color="13496B" w:sz="10" w:space="6"/>
@@ -13703,7 +13999,7 @@
                 <w:sz w:val="18"/>
                 <w:szCs w:val="18"/>
               </w:rPr>
-              <w:t>Cronograma o Gantt, facturación electrónica del constructor a su cliente final, integración BIM/CAD</w:t>
+              <w:t>Cronograma o Gantt</w:t>
             </w:r>
           </w:p>
         </w:tc>
@@ -13728,12 +14024,788 @@
                 <w:sz w:val="18"/>
                 <w:szCs w:val="18"/>
               </w:rPr>
+              <w:t xml:space="preserve">Fuera del MVP. Entra después como módulo 1, la programación de obra (decisión del dueño, 13 de octubre de 2026; documento 07). Su pantalla está en §13</w:t>
+            </w:r>
+          </w:p>
+        </w:tc>
+      </w:tr>
+      <w:tr>
+        <w:trPr>
+          <w:cantSplit/>
+        </w:trPr>
+        <w:tc>
+          <w:tcPr>
+            <w:tcW w:type="dxa" w:w="3200"/>
+            <w:shd w:fill="auto" w:color="auto" w:val="clear"/>
+            <w:tcMar>
+              <w:top w:type="dxa" w:w="70"/>
+              <w:left w:type="dxa" w:w="110"/>
+              <w:bottom w:type="dxa" w:w="70"/>
+              <w:right w:type="dxa" w:w="110"/>
+            </w:tcMar>
+          </w:tcPr>
+          <w:p>
+            <w:pPr>
+              <w:spacing w:after="40" w:before="40" w:line="240"/>
+              <w:jc w:val="left"/>
+            </w:pPr>
+            <w:r>
+              <w:rPr>
+                <w:sz w:val="18"/>
+                <w:szCs w:val="18"/>
+              </w:rPr>
+              <w:t>Facturación electrónica del constructor a su cliente final, integración BIM/CAD</w:t>
+            </w:r>
+          </w:p>
+        </w:tc>
+        <w:tc>
+          <w:tcPr>
+            <w:tcW w:type="dxa" w:w="2620"/>
+            <w:shd w:fill="auto" w:color="auto" w:val="clear"/>
+            <w:tcMar>
+              <w:top w:type="dxa" w:w="70"/>
+              <w:left w:type="dxa" w:w="110"/>
+              <w:bottom w:type="dxa" w:w="70"/>
+              <w:right w:type="dxa" w:w="110"/>
+            </w:tcMar>
+          </w:tcPr>
+          <w:p>
+            <w:pPr>
+              <w:spacing w:after="40" w:before="40" w:line="240"/>
+              <w:jc w:val="left"/>
+            </w:pPr>
+            <w:r>
+              <w:rPr>
+                <w:sz w:val="18"/>
+                <w:szCs w:val="18"/>
+              </w:rPr>
               <w:t xml:space="preserve">Fuera del producto, de forma permanente</w:t>
             </w:r>
           </w:p>
         </w:tc>
       </w:tr>
     </w:tbl>
+    <w:p>
+      <w:pPr>
+        <w:pStyle w:val="Heading1"/>
+        <w:pBdr>
+          <w:bottom w:val="single" w:color="13496B" w:sz="10" w:space="6"/>
+        </w:pBdr>
+        <w:spacing w:after="180" w:before="420"/>
+      </w:pPr>
+      <w:r>
+        <w:rPr>
+          <w:b/>
+          <w:bCs/>
+          <w:color w:val="13496B"/>
+          <w:sz w:val="30"/>
+          <w:szCs w:val="30"/>
+        </w:rPr>
+        <w:t>13. Módulo Programación de obra</w:t>
+      </w:r>
+    </w:p>
+    <w:p>
+      <w:pPr>
+        <w:spacing w:after="120" w:before="0" w:line="276"/>
+        <w:jc w:val="both"/>
+      </w:pPr>
+      <w:r>
+        <w:rPr>
+          <w:sz w:val="20"/>
+          <w:szCs w:val="20"/>
+        </w:rPr>
+        <w:t xml:space="preserve">Es el módulo 1 después del MVP (documento 07 §6), y sus reglas están allá. Este capítulo dice cómo se comporta la pantalla. El cronograma va uno a uno con el proyecto: se entra con «Cronograma» desde la mesa de trabajo y «Volver» lleva a ella. Usa los permisos del presupuesto (RN-43): quien puede verlo, ve su cronograma, y quien puede editarlo, lo edita y guarda líneas base. Con el proyecto Activo también se edita, porque el cronograma nunca escribe en el presupuesto; con el proyecto Cerrado es de solo lectura, y una franja lo dice.</w:t>
+      </w:r>
+    </w:p>
+    <w:p>
+      <w:pPr>
+        <w:pStyle w:val="Heading2"/>
+        <w:spacing w:after="120" w:before="300"/>
+      </w:pPr>
+      <w:r>
+        <w:rPr>
+          <w:b/>
+          <w:bCs/>
+          <w:color w:val="1F2933"/>
+          <w:sz w:val="23"/>
+          <w:szCs w:val="23"/>
+        </w:rPr>
+        <w:t>13.1 Crear el cronograma</w:t>
+      </w:r>
+    </w:p>
+    <w:p>
+      <w:pPr>
+        <w:spacing w:after="120" w:before="0" w:line="276"/>
+        <w:jc w:val="both"/>
+      </w:pPr>
+      <w:r>
+        <w:rPr>
+          <w:sz w:val="20"/>
+          <w:szCs w:val="20"/>
+        </w:rPr>
+        <w:t xml:space="preserve">Un proyecto sin cronograma muestra qué se va a crear: una actividad por ítem, los capítulos como barras resumen, la tarea «Administración y supervisión de obra» y los hitos de inicio y fin del proyecto, sin relaciones (RF-PRG-01). Pide la fecha de inicio y el calendario de la empresa, con el de por defecto ya elegido. «Crear cronograma» lo calcula y abre el Gantt.</w:t>
+      </w:r>
+    </w:p>
+    <w:p>
+      <w:pPr>
+        <w:pStyle w:val="Heading2"/>
+        <w:spacing w:after="120" w:before="300"/>
+      </w:pPr>
+      <w:r>
+        <w:rPr>
+          <w:b/>
+          <w:bCs/>
+          <w:color w:val="1F2933"/>
+          <w:sz w:val="23"/>
+          <w:szCs w:val="23"/>
+        </w:rPr>
+        <w:t>13.2 La pantalla</w:t>
+      </w:r>
+    </w:p>
+    <w:p>
+      <w:pPr>
+        <w:pStyle w:val="ListParagraph"/>
+        <w:numPr>
+          <w:ilvl w:val="0"/>
+          <w:numId w:val="2"/>
+        </w:numPr>
+        <w:spacing w:after="90" w:line="276"/>
+        <w:jc w:val="both"/>
+      </w:pPr>
+      <w:r>
+        <w:rPr>
+          <w:b/>
+          <w:bCs/>
+          <w:sz w:val="20"/>
+          <w:szCs w:val="20"/>
+        </w:rPr>
+        <w:t xml:space="preserve">El encabezado</w:t>
+      </w:r>
+      <w:r>
+        <w:rPr>
+          <w:sz w:val="20"/>
+          <w:szCs w:val="20"/>
+        </w:rPr>
+        <w:t xml:space="preserve"> dice el proyecto y su estado, la fecha de inicio (con «Cambiar»), el fin, la duración en días y el calendario de la obra (con «Ver y editar»). A la derecha, «Líneas base» y «Exportar». Mientras el servidor recalcula, dice «Recalculando…».</w:t>
+      </w:r>
+    </w:p>
+    <w:p>
+      <w:pPr>
+        <w:pStyle w:val="ListParagraph"/>
+        <w:numPr>
+          <w:ilvl w:val="0"/>
+          <w:numId w:val="2"/>
+        </w:numPr>
+        <w:spacing w:after="90" w:line="276"/>
+        <w:jc w:val="both"/>
+      </w:pPr>
+      <w:r>
+        <w:rPr>
+          <w:b/>
+          <w:bCs/>
+          <w:sz w:val="20"/>
+          <w:szCs w:val="20"/>
+        </w:rPr>
+        <w:t xml:space="preserve">Las franjas</w:t>
+      </w:r>
+      <w:r>
+        <w:rPr>
+          <w:sz w:val="20"/>
+          <w:szCs w:val="20"/>
+        </w:rPr>
+        <w:t xml:space="preserve">, arriba y a la vista de todos los que abren el cronograma. La del presupuesto (D-93) aparece cuando el presupuesto cambió desde el último cálculo: dice qué actividades entraron o salieron, qué duraciones cambiaron, el fin y el valor total antes y después, y el último cambio del presupuesto. Quien puede editar la cierra con «Entendido, cerrar aviso», y cualquier cambio en el cronograma también la cierra. Otra avisa si la obra pasa del último año de festivos del calendario, con «Copiar festivos». Otra dice cuántos días de más lleva la obra contra la línea base que se está mirando: la administración del presupuesto no cambia sola.</w:t>
+      </w:r>
+    </w:p>
+    <w:p>
+      <w:pPr>
+        <w:pStyle w:val="ListParagraph"/>
+        <w:numPr>
+          <w:ilvl w:val="0"/>
+          <w:numId w:val="2"/>
+        </w:numPr>
+        <w:spacing w:after="90" w:line="276"/>
+        <w:jc w:val="both"/>
+      </w:pPr>
+      <w:r>
+        <w:rPr>
+          <w:b/>
+          <w:bCs/>
+          <w:sz w:val="20"/>
+          <w:szCs w:val="20"/>
+        </w:rPr>
+        <w:t xml:space="preserve">Tres pestañas</w:t>
+      </w:r>
+      <w:r>
+        <w:rPr>
+          <w:sz w:val="20"/>
+          <w:szCs w:val="20"/>
+        </w:rPr>
+        <w:t xml:space="preserve">: Gantt, Curvas S y Revisión, esta con el número de actividades que hay que mirar.</w:t>
+      </w:r>
+    </w:p>
+    <w:p>
+      <w:pPr>
+        <w:pStyle w:val="Heading2"/>
+        <w:spacing w:after="120" w:before="300"/>
+      </w:pPr>
+      <w:r>
+        <w:rPr>
+          <w:b/>
+          <w:bCs/>
+          <w:color w:val="1F2933"/>
+          <w:sz w:val="23"/>
+          <w:szCs w:val="23"/>
+        </w:rPr>
+        <w:t>13.3 El Gantt</w:t>
+      </w:r>
+    </w:p>
+    <w:p>
+      <w:pPr>
+        <w:spacing w:after="120" w:before="0" w:line="276"/>
+        <w:jc w:val="both"/>
+      </w:pPr>
+      <w:r>
+        <w:rPr>
+          <w:sz w:val="20"/>
+          <w:szCs w:val="20"/>
+        </w:rPr>
+        <w:t xml:space="preserve">La tabla de actividades a la izquierda y las barras a la derecha, en un solo desplazamiento (RF-PRG-06, 07 §6.6). La tabla queda fija al correr el tiempo de lado, y la escala de tiempo fija al bajar. La pantalla usa el ancho entero de la ventana.</w:t>
+      </w:r>
+    </w:p>
+    <w:p>
+      <w:pPr>
+        <w:pStyle w:val="ListParagraph"/>
+        <w:numPr>
+          <w:ilvl w:val="0"/>
+          <w:numId w:val="2"/>
+        </w:numPr>
+        <w:spacing w:after="90" w:line="276"/>
+        <w:jc w:val="both"/>
+      </w:pPr>
+      <w:r>
+        <w:rPr>
+          <w:b/>
+          <w:bCs/>
+          <w:sz w:val="20"/>
+          <w:szCs w:val="20"/>
+        </w:rPr>
+        <w:t xml:space="preserve">La tabla</w:t>
+      </w:r>
+      <w:r>
+        <w:rPr>
+          <w:sz w:val="20"/>
+          <w:szCs w:val="20"/>
+        </w:rPr>
+        <w:t xml:space="preserve">: código, actividad, días, inicio, fin y holgura total. El orden es el del presupuesto, por la estructura, con los capítulos plegables; después las que ya no están en el presupuesto, la administración y «Hitos y trámites» con sus subgrupos. Una duración escrita a mano lleva un asterisco.</w:t>
+      </w:r>
+    </w:p>
+    <w:p>
+      <w:pPr>
+        <w:pStyle w:val="ListParagraph"/>
+        <w:numPr>
+          <w:ilvl w:val="0"/>
+          <w:numId w:val="2"/>
+        </w:numPr>
+        <w:spacing w:after="90" w:line="276"/>
+        <w:jc w:val="both"/>
+      </w:pPr>
+      <w:r>
+        <w:rPr>
+          <w:b/>
+          <w:bCs/>
+          <w:sz w:val="20"/>
+          <w:szCs w:val="20"/>
+        </w:rPr>
+        <w:t xml:space="preserve">Las barras</w:t>
+      </w:r>
+      <w:r>
+        <w:rPr>
+          <w:sz w:val="20"/>
+          <w:szCs w:val="20"/>
+        </w:rPr>
+        <w:t xml:space="preserve">: azules las normales y rojas las críticas; los capítulos y los grupos como barra resumen; la administración rayada; los hitos como rombos, verde el de inicio y oscuro el de fin; la línea base como una barra delgada debajo; una marca al final de la barra que termina a mitad de jornada (RN-27). El tiempo no laborable va sombreado, con la tarde del sábado en la escala por día. Una leyenda arriba lo explica, y lo crítico no se dice solo con color: la holgura está en su columna.</w:t>
+      </w:r>
+    </w:p>
+    <w:p>
+      <w:pPr>
+        <w:pStyle w:val="ListParagraph"/>
+        <w:numPr>
+          <w:ilvl w:val="0"/>
+          <w:numId w:val="2"/>
+        </w:numPr>
+        <w:spacing w:after="90" w:line="276"/>
+        <w:jc w:val="both"/>
+      </w:pPr>
+      <w:r>
+        <w:rPr>
+          <w:b/>
+          <w:bCs/>
+          <w:sz w:val="20"/>
+          <w:szCs w:val="20"/>
+        </w:rPr>
+        <w:t xml:space="preserve">La escala</w:t>
+      </w:r>
+      <w:r>
+        <w:rPr>
+          <w:sz w:val="20"/>
+          <w:szCs w:val="20"/>
+        </w:rPr>
+        <w:t xml:space="preserve"> es por día, semana o mes, y la línea base que se muestra se elige al lado. La pantalla recuerda las dos en el navegador. Sin elección guardada, muestra la primera línea base que se guardó.</w:t>
+      </w:r>
+    </w:p>
+    <w:p>
+      <w:pPr>
+        <w:pStyle w:val="ListParagraph"/>
+        <w:numPr>
+          <w:ilvl w:val="0"/>
+          <w:numId w:val="2"/>
+        </w:numPr>
+        <w:spacing w:after="90" w:line="276"/>
+        <w:jc w:val="both"/>
+      </w:pPr>
+      <w:r>
+        <w:rPr>
+          <w:b/>
+          <w:bCs/>
+          <w:sz w:val="20"/>
+          <w:szCs w:val="20"/>
+        </w:rPr>
+        <w:t xml:space="preserve">De solo lectura</w:t>
+      </w:r>
+      <w:r>
+        <w:rPr>
+          <w:sz w:val="20"/>
+          <w:szCs w:val="20"/>
+        </w:rPr>
+        <w:t xml:space="preserve">: no se arrastran barras. Un clic en una fila o en su barra la selecciona y abre su panel; con el teclado, las flechas arriba y abajo cambian de actividad.</w:t>
+      </w:r>
+    </w:p>
+    <w:p>
+      <w:pPr>
+        <w:pStyle w:val="ListParagraph"/>
+        <w:numPr>
+          <w:ilvl w:val="0"/>
+          <w:numId w:val="2"/>
+        </w:numPr>
+        <w:spacing w:after="90" w:line="276"/>
+        <w:jc w:val="both"/>
+      </w:pPr>
+      <w:r>
+        <w:rPr>
+          <w:b/>
+          <w:bCs/>
+          <w:sz w:val="20"/>
+          <w:szCs w:val="20"/>
+        </w:rPr>
+        <w:t xml:space="preserve">Con muchas actividades</w:t>
+      </w:r>
+      <w:r>
+        <w:rPr>
+          <w:sz w:val="20"/>
+          <w:szCs w:val="20"/>
+        </w:rPr>
+        <w:t xml:space="preserve"> solo se dibujan las filas que se ven, para que el desplazamiento no salte (RNF-29).</w:t>
+      </w:r>
+    </w:p>
+    <w:p>
+      <w:pPr>
+        <w:pStyle w:val="Heading2"/>
+        <w:spacing w:after="120" w:before="300"/>
+      </w:pPr>
+      <w:r>
+        <w:rPr>
+          <w:b/>
+          <w:bCs/>
+          <w:color w:val="1F2933"/>
+          <w:sz w:val="23"/>
+          <w:szCs w:val="23"/>
+        </w:rPr>
+        <w:t>13.4 El panel de una actividad</w:t>
+      </w:r>
+    </w:p>
+    <w:p>
+      <w:pPr>
+        <w:spacing w:after="120" w:before="0" w:line="276"/>
+        <w:jc w:val="both"/>
+      </w:pPr>
+      <w:r>
+        <w:rPr>
+          <w:sz w:val="20"/>
+          <w:szCs w:val="20"/>
+        </w:rPr>
+        <w:t xml:space="preserve">Un panel al lado, no modal, para que la barra siga a la vista. Arriba, el tipo y si es crítica; las fechas temprana y tardía, las holguras, la duración y el costo; y la línea base, con la variación del fin. Debajo, lo que se edita, que depende del tipo (CONTRATO §19.6), y «Guardar cambios» manda solo lo que cambió:</w:t>
+      </w:r>
+    </w:p>
+    <w:p>
+      <w:pPr>
+        <w:pStyle w:val="ListParagraph"/>
+        <w:numPr>
+          <w:ilvl w:val="0"/>
+          <w:numId w:val="2"/>
+        </w:numPr>
+        <w:spacing w:after="90" w:line="276"/>
+        <w:jc w:val="both"/>
+      </w:pPr>
+      <w:r>
+        <w:rPr>
+          <w:b/>
+          <w:bCs/>
+          <w:sz w:val="20"/>
+          <w:szCs w:val="20"/>
+        </w:rPr>
+        <w:t xml:space="preserve">Una actividad del presupuesto</w:t>
+      </w:r>
+      <w:r>
+        <w:rPr>
+          <w:sz w:val="20"/>
+          <w:szCs w:val="20"/>
+        </w:rPr>
+        <w:t xml:space="preserve">: las cuadrillas, la duración manual y las restricciones. Muestra la duración calculada y de dónde sale (cantidad, rendimiento por jornal y cuadrillas). Si el APU no tiene rendimiento, lo dice. Su nombre y su número son los del ítem.</w:t>
+      </w:r>
+    </w:p>
+    <w:p>
+      <w:pPr>
+        <w:pStyle w:val="ListParagraph"/>
+        <w:numPr>
+          <w:ilvl w:val="0"/>
+          <w:numId w:val="2"/>
+        </w:numPr>
+        <w:spacing w:after="90" w:line="276"/>
+        <w:jc w:val="both"/>
+      </w:pPr>
+      <w:r>
+        <w:rPr>
+          <w:b/>
+          <w:bCs/>
+          <w:sz w:val="20"/>
+          <w:szCs w:val="20"/>
+        </w:rPr>
+        <w:t xml:space="preserve">Un hito</w:t>
+      </w:r>
+      <w:r>
+        <w:rPr>
+          <w:sz w:val="20"/>
+          <w:szCs w:val="20"/>
+        </w:rPr>
+        <w:t xml:space="preserve">: código, nombre, subgrupo y restricciones. Un hito de fin no ofrece restricciones de inicio, ni uno de inicio de fin. </w:t>
+      </w:r>
+      <w:r>
+        <w:rPr>
+          <w:b/>
+          <w:bCs/>
+          <w:sz w:val="20"/>
+          <w:szCs w:val="20"/>
+        </w:rPr>
+        <w:t xml:space="preserve">Un trámite o espera</w:t>
+      </w:r>
+      <w:r>
+        <w:rPr>
+          <w:sz w:val="20"/>
+          <w:szCs w:val="20"/>
+        </w:rPr>
+        <w:t xml:space="preserve">: además, la duración y si corre todos los días, 24 horas. </w:t>
+      </w:r>
+      <w:r>
+        <w:rPr>
+          <w:b/>
+          <w:bCs/>
+          <w:sz w:val="20"/>
+          <w:szCs w:val="20"/>
+        </w:rPr>
+        <w:t xml:space="preserve">La administración</w:t>
+      </w:r>
+      <w:r>
+        <w:rPr>
+          <w:sz w:val="20"/>
+          <w:szCs w:val="20"/>
+        </w:rPr>
+        <w:t xml:space="preserve">: solo código y nombre, con la explicación de cómo se calcula.</w:t>
+      </w:r>
+    </w:p>
+    <w:p>
+      <w:pPr>
+        <w:pStyle w:val="ListParagraph"/>
+        <w:numPr>
+          <w:ilvl w:val="0"/>
+          <w:numId w:val="2"/>
+        </w:numPr>
+        <w:spacing w:after="90" w:line="276"/>
+        <w:jc w:val="both"/>
+      </w:pPr>
+      <w:r>
+        <w:rPr>
+          <w:b/>
+          <w:bCs/>
+          <w:sz w:val="20"/>
+          <w:szCs w:val="20"/>
+        </w:rPr>
+        <w:t xml:space="preserve">Las restricciones</w:t>
+      </w:r>
+      <w:r>
+        <w:rPr>
+          <w:sz w:val="20"/>
+          <w:szCs w:val="20"/>
+        </w:rPr>
+        <w:t xml:space="preserve"> (RN-30): una principal y una secundaria. La pantalla ofrece solo las parejas válidas: sin principal no hay secundaria, y «inicio el», «fin el» y las obligatorias no admiten secundaria.</w:t>
+      </w:r>
+    </w:p>
+    <w:p>
+      <w:pPr>
+        <w:pStyle w:val="ListParagraph"/>
+        <w:numPr>
+          <w:ilvl w:val="0"/>
+          <w:numId w:val="2"/>
+        </w:numPr>
+        <w:spacing w:after="90" w:line="276"/>
+        <w:jc w:val="both"/>
+      </w:pPr>
+      <w:r>
+        <w:rPr>
+          <w:b/>
+          <w:bCs/>
+          <w:sz w:val="20"/>
+          <w:szCs w:val="20"/>
+        </w:rPr>
+        <w:t xml:space="preserve">Las relaciones</w:t>
+      </w:r>
+      <w:r>
+        <w:rPr>
+          <w:sz w:val="20"/>
+          <w:szCs w:val="20"/>
+        </w:rPr>
+        <w:t xml:space="preserve"> (RF-PRG-04): las predecesoras y las sucesoras, cada una con su tipo (FC, CC, FF, CF) y su desfase en días, que se cambian ahí mismo. «Agregar» busca la otra actividad por código o nombre. Un clic en una relación lleva a esa actividad. Si la relación cerraría un círculo, no se guarda, el panel lo dice y la tabla marca todas las actividades del círculo.</w:t>
+      </w:r>
+    </w:p>
+    <w:p>
+      <w:pPr>
+        <w:pStyle w:val="ListParagraph"/>
+        <w:numPr>
+          <w:ilvl w:val="0"/>
+          <w:numId w:val="2"/>
+        </w:numPr>
+        <w:spacing w:after="90" w:line="276"/>
+        <w:jc w:val="both"/>
+      </w:pPr>
+      <w:r>
+        <w:rPr>
+          <w:b/>
+          <w:bCs/>
+          <w:sz w:val="20"/>
+          <w:szCs w:val="20"/>
+        </w:rPr>
+        <w:t xml:space="preserve">Subir, bajar y eliminar</w:t>
+      </w:r>
+      <w:r>
+        <w:rPr>
+          <w:sz w:val="20"/>
+          <w:szCs w:val="20"/>
+        </w:rPr>
+        <w:t xml:space="preserve"> solo en los hitos y trámites, y eliminar también en las actividades que ya no están en el presupuesto. Eliminar pide confirmación y dice cuántas relaciones se van con ella.</w:t>
+      </w:r>
+    </w:p>
+    <w:p>
+      <w:pPr>
+        <w:pStyle w:val="Heading2"/>
+        <w:spacing w:after="120" w:before="300"/>
+      </w:pPr>
+      <w:r>
+        <w:rPr>
+          <w:b/>
+          <w:bCs/>
+          <w:color w:val="1F2933"/>
+          <w:sz w:val="23"/>
+          <w:szCs w:val="23"/>
+        </w:rPr>
+        <w:t>13.5 Hitos, trámites y subgrupos</w:t>
+      </w:r>
+    </w:p>
+    <w:p>
+      <w:pPr>
+        <w:spacing w:after="120" w:before="0" w:line="276"/>
+        <w:jc w:val="both"/>
+      </w:pPr>
+      <w:r>
+        <w:rPr>
+          <w:sz w:val="20"/>
+          <w:szCs w:val="20"/>
+        </w:rPr>
+        <w:t xml:space="preserve">«Agregar hito o trámite» abre una capa con los tres tipos, cada uno con su explicación: hito de inicio, hito de fin, y trámite o espera sin costo (RF-PRG-03). Sin código, la base pone el siguiente H-nnn o T-nnn. Un trámite lleva su duración y, por defecto, corre todos los días. Al crearlo, queda seleccionado. «Agregar subgrupo» crea un subgrupo de «Hitos y trámites», de un solo nivel; en su fila están subir, bajar, renombrar y eliminar, y un subgrupo con actividades no se elimina.</w:t>
+      </w:r>
+    </w:p>
+    <w:p>
+      <w:pPr>
+        <w:pStyle w:val="Heading2"/>
+        <w:spacing w:after="120" w:before="300"/>
+      </w:pPr>
+      <w:r>
+        <w:rPr>
+          <w:b/>
+          <w:bCs/>
+          <w:color w:val="1F2933"/>
+          <w:sz w:val="23"/>
+          <w:szCs w:val="23"/>
+        </w:rPr>
+        <w:t>13.6 El calendario de la obra</w:t>
+      </w:r>
+    </w:p>
+    <w:p>
+      <w:pPr>
+        <w:spacing w:after="120" w:before="0" w:line="276"/>
+        <w:jc w:val="both"/>
+      </w:pPr>
+      <w:r>
+        <w:rPr>
+          <w:sz w:val="20"/>
+          <w:szCs w:val="20"/>
+        </w:rPr>
+        <w:t xml:space="preserve">«Ver y editar» abre la copia del proyecto con la misma capa de §11.8: la semana, los festivos y las excepciones, con la advertencia de que cambiarla recalcula el cronograma y no toca el calendario de la empresa. Abajo, «Reemplazarlo por un calendario de la empresa», con confirmación, porque se pierden las excepciones de la copia. El calendario corrido es fijo y no se muestra.</w:t>
+      </w:r>
+    </w:p>
+    <w:p>
+      <w:pPr>
+        <w:pStyle w:val="Heading2"/>
+        <w:spacing w:after="120" w:before="300"/>
+      </w:pPr>
+      <w:r>
+        <w:rPr>
+          <w:b/>
+          <w:bCs/>
+          <w:color w:val="1F2933"/>
+          <w:sz w:val="23"/>
+          <w:szCs w:val="23"/>
+        </w:rPr>
+        <w:t>13.7 Líneas base</w:t>
+      </w:r>
+    </w:p>
+    <w:p>
+      <w:pPr>
+        <w:spacing w:after="120" w:before="0" w:line="276"/>
+        <w:jc w:val="both"/>
+      </w:pPr>
+      <w:r>
+        <w:rPr>
+          <w:sz w:val="20"/>
+          <w:szCs w:val="20"/>
+        </w:rPr>
+        <w:t xml:space="preserve">La capa de líneas base explica qué guarda una línea base y lista las que hay, con quién y cuándo la guardó y cuándo termina; desde ahí se elige cuál se muestra. Solo con el proyecto Activo se guardan, se reemplazan y se eliminan (RF-PRG-09): en otro estado la capa lo dice. Un nombre que ya existe no sobrescribe en silencio: pregunta si se reemplaza. Si el presupuesto cambió desde que se abrió el cronograma, no se guarda nada y se muestran las fechas nuevas para revisarlas.</w:t>
+      </w:r>
+    </w:p>
+    <w:p>
+      <w:pPr>
+        <w:pStyle w:val="Heading2"/>
+        <w:spacing w:after="120" w:before="300"/>
+      </w:pPr>
+      <w:r>
+        <w:rPr>
+          <w:b/>
+          <w:bCs/>
+          <w:color w:val="1F2933"/>
+          <w:sz w:val="23"/>
+          <w:szCs w:val="23"/>
+        </w:rPr>
+        <w:t>13.8 Curvas S</w:t>
+      </w:r>
+    </w:p>
+    <w:p>
+      <w:pPr>
+        <w:spacing w:after="120" w:before="0" w:line="276"/>
+        <w:jc w:val="both"/>
+      </w:pPr>
+      <w:r>
+        <w:rPr>
+          <w:sz w:val="20"/>
+          <w:szCs w:val="20"/>
+        </w:rPr>
+        <w:t xml:space="preserve">Facturación y costo acumulados, por semana o por mes, con los de la línea base punteados (RF-PRG-08). Arriba, los dos totales. Al pasar el mouse o con las flechas, un globo da las cifras de cada curva en ese periodo, y «Ver las cifras en una tabla» las muestra todas. Las cifras son las del servidor: la pantalla no reparte dinero.</w:t>
+      </w:r>
+    </w:p>
+    <w:p>
+      <w:pPr>
+        <w:pStyle w:val="Heading2"/>
+        <w:spacing w:after="120" w:before="300"/>
+      </w:pPr>
+      <w:r>
+        <w:rPr>
+          <w:b/>
+          <w:bCs/>
+          <w:color w:val="1F2933"/>
+          <w:sz w:val="23"/>
+          <w:szCs w:val="23"/>
+        </w:rPr>
+        <w:t>13.9 Revisión</w:t>
+      </w:r>
+    </w:p>
+    <w:p>
+      <w:pPr>
+        <w:spacing w:after="120" w:before="0" w:line="276"/>
+        <w:jc w:val="both"/>
+      </w:pPr>
+      <w:r>
+        <w:rPr>
+          <w:sz w:val="20"/>
+          <w:szCs w:val="20"/>
+        </w:rPr>
+        <w:t xml:space="preserve">Lo que hay que mirar antes de dar el cronograma por terminado (RF-PRG-07, RN-39), por grupos: con holgura negativa y ya no están en el presupuesto primero, porque son los graves; después sin programar, sin rendimiento ni duración, con duración manual distinta de la calculada, sin predecesora y sin sucesora. Cada actividad es un enlace que la abre en el Gantt.</w:t>
+      </w:r>
+    </w:p>
+    <w:p>
+      <w:pPr>
+        <w:pStyle w:val="Heading2"/>
+        <w:spacing w:after="120" w:before="300"/>
+      </w:pPr>
+      <w:r>
+        <w:rPr>
+          <w:b/>
+          <w:bCs/>
+          <w:color w:val="1F2933"/>
+          <w:sz w:val="23"/>
+          <w:szCs w:val="23"/>
+        </w:rPr>
+        <w:t>13.10 Exportar</w:t>
+      </w:r>
+    </w:p>
+    <w:p>
+      <w:pPr>
+        <w:spacing w:after="120" w:before="0" w:line="276"/>
+        <w:jc w:val="both"/>
+      </w:pPr>
+      <w:r>
+        <w:rPr>
+          <w:sz w:val="20"/>
+          <w:szCs w:val="20"/>
+        </w:rPr>
+        <w:t xml:space="preserve">PDF del Gantt, con escala y línea base, y XML para MS Project, con la opción de incluir el costo, que por defecto no va (RF-PRG-10, RF-PRG-11). Antes de descargar el XML, la capa dice lo que Project no representa: una sola restricción por actividad y la administración como tarea normal, y que hace falta MS Project para abrirlo. El XER para P6 aparece cuando haya versiones de P6 para elegir.</w:t>
+      </w:r>
+    </w:p>
+    <w:p>
+      <w:pPr>
+        <w:pStyle w:val="Heading2"/>
+        <w:spacing w:after="120" w:before="300"/>
+      </w:pPr>
+      <w:r>
+        <w:rPr>
+          <w:b/>
+          <w:bCs/>
+          <w:color w:val="1F2933"/>
+          <w:sz w:val="23"/>
+          <w:szCs w:val="23"/>
+        </w:rPr>
+        <w:t>13.11 Dos personas a la vez</w:t>
+      </w:r>
+    </w:p>
+    <w:p>
+      <w:pPr>
+        <w:spacing w:after="120" w:before="0" w:line="276"/>
+        <w:jc w:val="both"/>
+      </w:pPr>
+      <w:r>
+        <w:rPr>
+          <w:sz w:val="20"/>
+          <w:szCs w:val="20"/>
+        </w:rPr>
+        <w:t xml:space="preserve">Si otra persona cambió el cronograma mientras se editaba (o el presupuesto cambió de estado), el cambio no se guarda: la pantalla muestra la versión nueva y una franja con el cambio rechazado, en palabras, y «Aplicar mi cambio de nuevo» para volver a hacerlo sobre la versión nueva, o «Descartar mi cambio» (07 §6.9). Nadie pisa el trabajo de otro sin saberlo, y nadie pierde lo que hizo.</w:t>
+      </w:r>
+    </w:p>
     <w:p>
       <w:pPr>
         <w:spacing w:after="200"/>

</xml_diff>

<commit_message>
feat(web): el mes del calendario, con la semana tipo y las excepciones juntas; 02 y DISENO
Co-Authored-By: Claude Opus 5.5 <noreply@anthropic.com>
Claude-Session: https://claude.ai/code/session_01QkUecTxXWHcSEBT7CByXQu
</commit_message>
<xml_diff>
--- a/docs/02 - Guia de comportamiento de interfaz.docx
+++ b/docs/02 - Guia de comportamiento de interfaz.docx
@@ -12983,6 +12983,60 @@
           <w:szCs w:val="20"/>
         </w:rPr>
         <w:t xml:space="preserve">, en bloques de media hora, como en P6: arrastrando con el mouse, o con las flechas y la barra espaciadora. El total por día y por semana se ve al lado, y debajo cada día en texto. Un turno que pasa la medianoche se marca en los dos días.</w:t>
+      </w:r>
+    </w:p>
+    <w:p>
+      <w:pPr>
+        <w:pStyle w:val="ListParagraph"/>
+        <w:numPr>
+          <w:ilvl w:val="0"/>
+          <w:numId w:val="2"/>
+        </w:numPr>
+        <w:spacing w:after="90" w:line="276"/>
+        <w:jc w:val="both"/>
+      </w:pPr>
+      <w:r>
+        <w:rPr>
+          <w:b/>
+          <w:bCs/>
+          <w:sz w:val="20"/>
+          <w:szCs w:val="20"/>
+        </w:rPr>
+        <w:t xml:space="preserve">Esa tabla es la semana tipo</w:t>
+      </w:r>
+      <w:r>
+        <w:rPr>
+          <w:sz w:val="20"/>
+          <w:szCs w:val="20"/>
+        </w:rPr>
+        <w:t xml:space="preserve">: cómo se trabaja un lunes cualquiera, un martes cualquiera, y se repite todas las semanas. Cada hora del día tiene dos casillas, de media hora cada una, para poder marcar entradas como las 7:30 o un almuerzo de 30 minutos. No es media jornada: una jornada de 8 horas son 16 casillas.</w:t>
+      </w:r>
+    </w:p>
+    <w:p>
+      <w:pPr>
+        <w:pStyle w:val="ListParagraph"/>
+        <w:numPr>
+          <w:ilvl w:val="0"/>
+          <w:numId w:val="2"/>
+        </w:numPr>
+        <w:spacing w:after="90" w:line="276"/>
+        <w:jc w:val="both"/>
+      </w:pPr>
+      <w:r>
+        <w:rPr>
+          <w:b/>
+          <w:bCs/>
+          <w:sz w:val="20"/>
+          <w:szCs w:val="20"/>
+        </w:rPr>
+        <w:t xml:space="preserve">El mes</w:t>
+      </w:r>
+      <w:r>
+        <w:rPr>
+          <w:sz w:val="20"/>
+          <w:szCs w:val="20"/>
+        </w:rPr>
+        <w:t xml:space="preserve"> muestra cada fecha como queda con la semana tipo y las excepciones juntas, como la vista de mes del calendario de P6: los días que se trabajan, con sus horas; los que no se trabajan por la semana tipo; los festivos y días libres; y los días con otras horas. Se pasa de mes en mes. Un clic en un día abre su excepción, y la crea si no la tiene; «Quitar la excepción» devuelve ese día a la semana tipo. En el calendario de la obra, abre en el mes del inicio del cronograma.</w:t>
       </w:r>
     </w:p>
     <w:p>

</xml_diff>

<commit_message>
feat(web): niveles en la mesa y el cronograma, columnas ajustables y el Gantt hasta el fondo de la ventana; el APU sin cifras de ejemplo
Co-Authored-By: Claude Opus 5.5 <noreply@anthropic.com>
Claude-Session: https://claude.ai/code/session_01QkUecTxXWHcSEBT7CByXQu
</commit_message>
<xml_diff>
--- a/docs/02 - Guia de comportamiento de interfaz.docx
+++ b/docs/02 - Guia de comportamiento de interfaz.docx
@@ -3959,7 +3959,7 @@
                 <w:sz w:val="18"/>
                 <w:szCs w:val="18"/>
               </w:rPr>
-              <w:t xml:space="preserve">Cuántas unidades del recurso intervienen a la vez en la actividad. Viene precargado en 1, que es el caso normal en materiales.</w:t>
+              <w:t xml:space="preserve">Cuántas unidades del recurso intervienen a la vez en la actividad. Nace vacía: la escribe quien arma el APU.</w:t>
             </w:r>
           </w:p>
         </w:tc>
@@ -4039,7 +4039,7 @@
                 <w:sz w:val="18"/>
                 <w:szCs w:val="18"/>
               </w:rPr>
-              <w:t xml:space="preserve">Cuánto consume UNA unidad de ese recurso por cada unidad de obra. Viene precargado en 1.</w:t>
+              <w:t xml:space="preserve">Cuánto consume UNA unidad de ese recurso por cada unidad de obra. Nace vacío.</w:t>
             </w:r>
           </w:p>
         </w:tc>
@@ -4206,7 +4206,7 @@
                 <w:sz w:val="19"/>
                 <w:szCs w:val="19"/>
               </w:rPr>
-              <w:t xml:space="preserve">Si el usuario entiende que Cantidad y Rendimiento miden lo mismo, va a multiplicar dos veces el consumo y el APU saldrá inflado sin que nada falle ni avise. Las etiquetas y el texto de ayuda del formulario tienen que dejar clara la diferencia, y ambos campos deben venir con el valor 1 por defecto.</w:t>
+              <w:t xml:space="preserve">Si el usuario entiende que Cantidad y Rendimiento miden lo mismo, va a multiplicar dos veces el consumo y el APU saldrá inflado sin que nada falle ni avise. Las etiquetas y el texto de ayuda del formulario tienen que dejar clara la diferencia. Los dos campos nacen vacíos, sin una cifra de ejemplo adentro (decisión del dueño, 22 de octubre de 2026): cada cifra la escribe quien arma el APU, y si falta una, guardar dice cuál.</w:t>
             </w:r>
           </w:p>
           <w:p>
@@ -7223,6 +7223,24 @@
     </w:p>
     <w:p>
       <w:pPr>
+        <w:pStyle w:val="Heading3"/>
+        <w:spacing w:after="120"/>
+      </w:pPr>
+      <w:r>
+        <w:rPr/>
+        <w:t>Ver por niveles</w:t>
+      </w:r>
+    </w:p>
+    <w:p>
+      <w:pPr>
+        <w:spacing w:after="120"/>
+      </w:pPr>
+      <w:r>
+        <w:t xml:space="preserve">Sobre la tabla, «Nivel» deja elegir hasta qué nivel se ve la estructura, como los niveles de esquema de Excel: el 1 muestra solo los capítulos, plegados; el 2, los capítulos y lo que cuelga de ellos; y así hasta el último, que lo muestra todo con las actividades. Cuántos niveles hay sale de la estructura del proyecto: con capítulos, subcapítulos y actividades son tres. Al lado, «Expandir todo» y «Contraer todo». Plegar o desplegar un capítulo a mano sigue funcionando, y entonces ningún nivel queda marcado. Es solo una forma de ver: no se guarda ni cambia nada del proyecto (pedido del dueño, 22 de octubre de 2026).</w:t>
+      </w:r>
+    </w:p>
+    <w:p>
+      <w:pPr>
         <w:pStyle w:val="Heading2"/>
         <w:spacing w:after="120" w:before="300"/>
       </w:pPr>
@@ -14323,7 +14341,7 @@
           <w:sz w:val="20"/>
           <w:szCs w:val="20"/>
         </w:rPr>
-        <w:t xml:space="preserve">La tabla de actividades a la izquierda y las barras a la derecha, en un solo desplazamiento (RF-PRG-06, 07 §6.6). La tabla queda fija al correr el tiempo de lado, y la escala de tiempo fija al bajar. La pantalla usa el ancho entero de la ventana.</w:t>
+        <w:t xml:space="preserve">La tabla de actividades a la izquierda y las barras a la derecha, en un solo desplazamiento (RF-PRG-06, 07 §6.6). La tabla queda fija al correr el tiempo de lado, y la escala de tiempo fija al bajar. La pantalla usa el ancho entero de la ventana, y el Gantt llega hasta el fondo de ella: su barra de desplazamiento de lado siempre se ve, sin bajar la página. Con poco espacio arriba, no baja de 320 píxeles de alto.</w:t>
       </w:r>
     </w:p>
     <w:p>
@@ -14350,7 +14368,7 @@
           <w:sz w:val="20"/>
           <w:szCs w:val="20"/>
         </w:rPr>
-        <w:t xml:space="preserve">: código, actividad, días, inicio, fin y holgura total. El orden es el del presupuesto, por la estructura, con los capítulos plegables; después las que ya no están en el presupuesto, la administración y «Hitos y trámites» con sus subgrupos. Una duración escrita a mano lleva un asterisco.</w:t>
+        <w:t xml:space="preserve">: código, actividad, días, inicio, fin y holgura total. El orden es el del presupuesto, por la estructura, con los capítulos plegables; después las que ya no están en el presupuesto, la administración y «Hitos y trámites» con sus subgrupos. Una duración escrita a mano lleva un asterisco. El ancho de cada columna se ajusta arrastrando el borde derecho de su encabezado, o con las flechas sobre ese borde, y doble clic lo devuelve al de siempre; dura mientras se está en la pantalla y no se guarda.</w:t>
       </w:r>
     </w:p>
     <w:p>
@@ -14432,6 +14450,33 @@
           <w:szCs w:val="20"/>
         </w:rPr>
         <w:t xml:space="preserve">: no se arrastran barras. Un clic en una fila o en su barra la selecciona y abre su panel; con el teclado, las flechas arriba y abajo cambian de actividad.</w:t>
+      </w:r>
+    </w:p>
+    <w:p>
+      <w:pPr>
+        <w:pStyle w:val="ListParagraph"/>
+        <w:numPr>
+          <w:ilvl w:val="0"/>
+          <w:numId w:val="2"/>
+        </w:numPr>
+        <w:spacing w:after="90" w:line="276"/>
+        <w:jc w:val="both"/>
+      </w:pPr>
+      <w:r>
+        <w:rPr>
+          <w:b/>
+          <w:bCs/>
+          <w:sz w:val="20"/>
+          <w:szCs w:val="20"/>
+        </w:rPr>
+        <w:t xml:space="preserve">Los niveles</w:t>
+      </w:r>
+      <w:r>
+        <w:rPr>
+          <w:sz w:val="20"/>
+          <w:szCs w:val="20"/>
+        </w:rPr>
+        <w:t xml:space="preserve">: «Nivel», «Expandir todo» y «Contraer todo», en la barra del Gantt, como en la mesa (§8.2). «Hitos y trámites» y «Ya no están en el presupuesto» cuentan como capítulos de primer nivel, y los subgrupos, como subcapítulos.</w:t>
       </w:r>
     </w:p>
     <w:p>

</xml_diff>

<commit_message>
feat(web): el nivel como lista desplegable y expandir o contraer en el menu de tres puntos
Co-Authored-By: Claude Opus 5.5 <noreply@anthropic.com>
Claude-Session: https://claude.ai/code/session_01QkUecTxXWHcSEBT7CByXQu
</commit_message>
<xml_diff>
--- a/docs/02 - Guia de comportamiento de interfaz.docx
+++ b/docs/02 - Guia de comportamiento de interfaz.docx
@@ -7236,7 +7236,7 @@
         <w:spacing w:after="120"/>
       </w:pPr>
       <w:r>
-        <w:t xml:space="preserve">Sobre la tabla, «Nivel» deja elegir hasta qué nivel se ve la estructura, como los niveles de esquema de Excel: el 1 muestra solo los capítulos, plegados; el 2, los capítulos y lo que cuelga de ellos; y así hasta el último, que lo muestra todo con las actividades. Cuántos niveles hay sale de la estructura del proyecto: con capítulos, subcapítulos y actividades son tres. Al lado, «Expandir todo» y «Contraer todo». Plegar o desplegar un capítulo a mano sigue funcionando, y entonces ningún nivel queda marcado. Es solo una forma de ver: no se guarda ni cambia nada del proyecto (pedido del dueño, 22 de octubre de 2026).</w:t>
+        <w:t xml:space="preserve">Sobre la tabla, «Nivel» deja elegir hasta qué nivel se ve la estructura, como los niveles de esquema de Excel: el 1 muestra solo los capítulos, plegados; el 2, los capítulos y lo que cuelga de ellos; y así hasta el último, que lo muestra todo con las actividades. Cuántos niveles hay sale de la estructura del proyecto: con capítulos, subcapítulos y actividades son tres. Es una lista desplegable, «Nivel 1 ⌄», y a su lado un botón de tres puntos con «Expandir todo» y «Contraer todo» (decisión del dueño, 23 de octubre de 2026). Plegar o desplegar un capítulo a mano sigue funcionando, y entonces ningún nivel queda marcado. Es solo una forma de ver: no se guarda ni cambia nada del proyecto (pedido del dueño, 22 de octubre de 2026).</w:t>
       </w:r>
     </w:p>
     <w:p>
@@ -14476,7 +14476,7 @@
           <w:sz w:val="20"/>
           <w:szCs w:val="20"/>
         </w:rPr>
-        <w:t xml:space="preserve">: «Nivel», «Expandir todo» y «Contraer todo», en la barra del Gantt, como en la mesa (§8.2). «Hitos y trámites» y «Ya no están en el presupuesto» cuentan como capítulos de primer nivel, y los subgrupos, como subcapítulos.</w:t>
+        <w:t xml:space="preserve">: «Nivel» y el botón de tres puntos con «Expandir todo» y «Contraer todo», en la barra del Gantt, como en la mesa (§8.2). «Hitos y trámites» y «Ya no están en el presupuesto» cuentan como capítulos de primer nivel, y los subgrupos, como subcapítulos.</w:t>
       </w:r>
     </w:p>
     <w:p>

</xml_diff>